<commit_message>
docs: milestone 2c record in progress, and the plan's Word copy rebuilt
Co-Authored-By: Claude Opus 5.5 <noreply@anthropic.com>
Claude-Session: https://claude.ai/code/session_014EQPu9NsbP148AgnT6XtCM
</commit_message>
<xml_diff>
--- a/docs/plans/m2c-permissions.docx
+++ b/docs/plans/m2c-permissions.docx
@@ -223,12 +223,12 @@
       <w:pPr>
         <w:spacing w:after="40"/>
       </w:pPr>
-      <w:hyperlink w:history="1" w:anchor="h_7c113b7374">
+      <w:hyperlink w:history="1" w:anchor="h_35972186a7">
         <w:r>
           <w:rPr>
             <w:color w:val="2F5496"/>
           </w:rPr>
-          <w:t xml:space="preserve">Decisions the owner should confirm</w:t>
+          <w:t xml:space="preserve">Decisions the owner confirmed (all seven accepted, 2026-10-04)</w:t>
         </w:r>
       </w:hyperlink>
     </w:p>
@@ -736,9 +736,9 @@
         <w:pStyle w:val="Heading2"/>
         <w:keepNext/>
       </w:pPr>
-      <w:bookmarkStart w:name="h_7c113b7374" w:id="3"/>
-      <w:r>
-        <w:t xml:space="preserve">Decisions the owner should confirm</w:t>
+      <w:bookmarkStart w:name="h_35972186a7" w:id="3"/>
+      <w:r>
+        <w:t xml:space="preserve">Decisions the owner confirmed (all seven accepted, 2026-10-04)</w:t>
       </w:r>
       <w:bookmarkEnd w:id="3"/>
     </w:p>
@@ -12951,7 +12951,7 @@
           <w:sz w:val="18"/>
           <w:szCs w:val="18"/>
         </w:rPr>
-        <w:t xml:space="preserve">    expect(scoped.length).toBeGreaterThanOrEqual(2)</w:t>
+        <w:t xml:space="preserve">    expect(scoped.length).toBeGreaterThanOrEqual(1) // raised as each users route arrives (Tasks 6 and 7)</w:t>
       </w:r>
     </w:p>
     <w:p>

</xml_diff>